<commit_message>
Thêm slide thuyết trình, điền thông tin nhóm vào tài liệu
Co-Authored-By: Claude Opus 5.5 <noreply@anthropic.com>
Claude-Session: https://claude.ai/code/session_019GPt2YzaMnuKWQr3TmCixm
</commit_message>
<xml_diff>
--- a/docs/1_Tong_quan_du_an.docx
+++ b/docs/1_Tong_quan_du_an.docx
@@ -71,8 +71,25 @@
     </w:p>
     <w:p>
       <w:pPr>
-        <w:spacing w:after="80" w:before="1000"/>
+        <w:spacing w:after="80" w:before="900"/>
         <w:ind w:left="2600"/>
+        <w:jc w:val="left"/>
+      </w:pPr>
+      <w:r>
+        <w:rPr>
+          <w:rFonts w:ascii="Times New Roman" w:cs="Times New Roman" w:eastAsia="Times New Roman" w:hAnsi="Times New Roman"/>
+          <w:b/>
+          <w:bCs/>
+          <w:sz w:val="26"/>
+          <w:szCs w:val="26"/>
+        </w:rPr>
+        <w:t xml:space="preserve">Sinh viên thực hiện:</w:t>
+      </w:r>
+    </w:p>
+    <w:p>
+      <w:pPr>
+        <w:spacing w:after="60"/>
+        <w:ind w:left="3000"/>
         <w:jc w:val="left"/>
       </w:pPr>
       <w:r>
@@ -81,13 +98,13 @@
           <w:sz w:val="26"/>
           <w:szCs w:val="26"/>
         </w:rPr>
-        <w:t xml:space="preserve">Sinh viên thực hiện: ........................................</w:t>
-      </w:r>
-    </w:p>
-    <w:p>
-      <w:pPr>
-        <w:spacing w:after="80"/>
-        <w:ind w:left="2600"/>
+        <w:t xml:space="preserve">2001230477 – Nguyễn Quốc Lộc</w:t>
+      </w:r>
+    </w:p>
+    <w:p>
+      <w:pPr>
+        <w:spacing w:after="60"/>
+        <w:ind w:left="3000"/>
         <w:jc w:val="left"/>
       </w:pPr>
       <w:r>
@@ -96,13 +113,13 @@
           <w:sz w:val="26"/>
           <w:szCs w:val="26"/>
         </w:rPr>
-        <w:t xml:space="preserve">Mã số sinh viên:     ........................................</w:t>
-      </w:r>
-    </w:p>
-    <w:p>
-      <w:pPr>
-        <w:spacing w:after="80"/>
-        <w:ind w:left="2600"/>
+        <w:t xml:space="preserve">2001230022 – Phan Tấn Anh</w:t>
+      </w:r>
+    </w:p>
+    <w:p>
+      <w:pPr>
+        <w:spacing w:after="60"/>
+        <w:ind w:left="3000"/>
         <w:jc w:val="left"/>
       </w:pPr>
       <w:r>
@@ -111,12 +128,37 @@
           <w:sz w:val="26"/>
           <w:szCs w:val="26"/>
         </w:rPr>
-        <w:t xml:space="preserve">Giảng viên hướng dẫn: ......................................</w:t>
-      </w:r>
-    </w:p>
-    <w:p>
-      <w:pPr>
-        <w:spacing w:before="1400"/>
+        <w:t xml:space="preserve">2001230172 – Nguyễn Hải Đăng</w:t>
+      </w:r>
+    </w:p>
+    <w:p>
+      <w:pPr>
+        <w:spacing w:after="80" w:before="200"/>
+        <w:ind w:left="2600"/>
+        <w:jc w:val="left"/>
+      </w:pPr>
+      <w:r>
+        <w:rPr>
+          <w:rFonts w:ascii="Times New Roman" w:cs="Times New Roman" w:eastAsia="Times New Roman" w:hAnsi="Times New Roman"/>
+          <w:b/>
+          <w:bCs/>
+          <w:sz w:val="26"/>
+          <w:szCs w:val="26"/>
+        </w:rPr>
+        <w:t xml:space="preserve">Giảng viên hướng dẫn: </w:t>
+      </w:r>
+      <w:r>
+        <w:rPr>
+          <w:rFonts w:ascii="Times New Roman" w:cs="Times New Roman" w:eastAsia="Times New Roman" w:hAnsi="Times New Roman"/>
+          <w:sz w:val="26"/>
+          <w:szCs w:val="26"/>
+        </w:rPr>
+        <w:t xml:space="preserve">ThS. Trần Quang Bình</w:t>
+      </w:r>
+    </w:p>
+    <w:p>
+      <w:pPr>
+        <w:spacing w:before="1100"/>
         <w:jc w:val="center"/>
       </w:pPr>
       <w:r>

</xml_diff>

<commit_message>
Do thi tri thuc bang hinh, thu thach tu chon de
</commit_message>
<xml_diff>
--- a/docs/1_Tong_quan_du_an.docx
+++ b/docs/1_Tong_quan_du_an.docx
@@ -2077,15 +2077,29 @@
     </w:p>
     <w:p>
       <w:pPr>
+        <w:spacing w:after="120" w:line="312"/>
+        <w:jc w:val="both"/>
+      </w:pPr>
+      <w:r>
+        <w:rPr>
+          <w:rFonts w:ascii="Times New Roman" w:cs="Times New Roman" w:eastAsia="Times New Roman" w:hAnsi="Times New Roman"/>
+          <w:sz w:val="26"/>
+          <w:szCs w:val="26"/>
+        </w:rPr>
+        <w:t xml:space="preserve">Trên giao diện, trang Đồ thị tri thức vẽ sơ đồ này bằng hình ảnh của từng hình. Mũi tên đi từ hình tổng quát xuống hình đặc biệt hơn; trên mũi tên ghi điều kiện cần thêm, lấy từ các dấu hiệu nhận biết ở mục 2.3. Nếu không có dấu hiệu đi thẳng giữa hai hình (ví dụ từ hình thang sang hình bình hành) thì ghi dấu hiệu từ hình tổ tiên gần nhất (ở đây là tứ giác).</w:t>
+      </w:r>
+    </w:p>
+    <w:p>
+      <w:pPr>
         <w:spacing w:after="60" w:before="120"/>
         <w:jc w:val="center"/>
       </w:pPr>
       <w:r>
         <w:drawing>
           <wp:inline distT="0" distB="0" distL="0" distR="0">
-            <wp:extent cx="5715000" cy="4648200"/>
+            <wp:extent cx="5334000" cy="5267325"/>
             <wp:effectExtent t="0" r="0" b="0" l="0"/>
-            <wp:docPr id="1" name="09a_do_thi_so_do.png" descr="Sơ đồ phân cấp tứ giác và số liệu đồ thị tri thức, lấy từ Neo4j" title="Sơ đồ phân cấp tứ giác và số liệu đồ thị tri thức, lấy từ Neo4j"/>
+            <wp:docPr id="1" name="09_do_thi_tri_thuc.png" descr="Đồ thị tri thức trên giao diện: hình ảnh từng hình và điều kiện để suy ra hình kia, lấy từ Neo4j" title="Đồ thị tri thức trên giao diện: hình ảnh từng hình và điều kiện để suy ra hình kia, lấy từ Neo4j"/>
             <wp:cNvGraphicFramePr>
               <a:graphicFrameLocks xmlns:a="http://schemas.openxmlformats.org/drawingml/2006/main" noChangeAspect="1"/>
             </wp:cNvGraphicFramePr>
@@ -2108,7 +2122,7 @@
                   <pic:spPr bwMode="auto">
                     <a:xfrm>
                       <a:off x="0" y="0"/>
-                      <a:ext cx="5715000" cy="4648200"/>
+                      <a:ext cx="5334000" cy="5267325"/>
                     </a:xfrm>
                     <a:prstGeom prst="rect">
                       <a:avLst/>
@@ -2134,7 +2148,7 @@
           <w:sz w:val="22"/>
           <w:szCs w:val="22"/>
         </w:rPr>
-        <w:t xml:space="preserve">Hình 1. Sơ đồ phân cấp tứ giác và số liệu đồ thị tri thức, lấy từ Neo4j</w:t>
+        <w:t xml:space="preserve">Hình 1. Đồ thị tri thức trên giao diện: hình ảnh từng hình và điều kiện để suy ra hình kia, lấy từ Neo4j</w:t>
       </w:r>
     </w:p>
     <w:p>
@@ -7661,7 +7675,7 @@
                 <w:sz w:val="22"/>
                 <w:szCs w:val="22"/>
               </w:rPr>
-              <w:t xml:space="preserve">ma, ten, nhom, nhom_ten, thu_tu</w:t>
+              <w:t xml:space="preserve">ma, ten, ten_ngan, nhom, nhom_ten, thu_tu</w:t>
             </w:r>
           </w:p>
         </w:tc>
@@ -11397,6 +11411,20 @@
     </w:p>
     <w:p>
       <w:pPr>
+        <w:spacing w:after="120" w:line="312"/>
+        <w:jc w:val="both"/>
+      </w:pPr>
+      <w:r>
+        <w:rPr>
+          <w:rFonts w:ascii="Times New Roman" w:cs="Times New Roman" w:eastAsia="Times New Roman" w:hAnsi="Times New Roman"/>
+          <w:sz w:val="26"/>
+          <w:szCs w:val="26"/>
+        </w:rPr>
+        <w:t xml:space="preserve">Ngoài chế độ theo vòng (bắt đầu từ tứ giác thường), trang Thử thách có chế độ Tự chọn đề: người chơi chọn hình cho sẵn và hình cần tạo, ví dụ từ hình bình hành tạo hình vuông. Danh sách hình cần tạo là các hình con cháu của hình cho sẵn theo quan hệ LA_MOT. Hình cho sẵn được sinh ngẫu nhiên trên lưới bằng các vectơ nguyên (hàm sinh_hinh trong src/hinh_hoc.py) và chỉ được dùng khi bộ suy luận Neo4j kết luận đúng loại hình đó. Để kéo dễ hơn, người chơi có thể kéo cả cạnh (cạnh giữ nguyên hướng nên giữ được cặp cạnh song song), kéo cả hình, nhích từng ô bằng phím mũi tên, và xem các đường gợi ý: đường đặt đỉnh vào sẽ có cặp cạnh song song hoặc góc vuông.</w:t>
+      </w:r>
+    </w:p>
+    <w:p>
+      <w:pPr>
         <w:spacing w:after="60" w:before="120"/>
         <w:jc w:val="center"/>
       </w:pPr>
@@ -12271,7 +12299,7 @@
                 <w:sz w:val="22"/>
                 <w:szCs w:val="22"/>
               </w:rPr>
-              <w:t xml:space="preserve">45 ca kiểm thử cho tri thức, bộ suy luận, bộ tính toán và nhận dạng từ toạ độ</w:t>
+              <w:t xml:space="preserve">50 ca kiểm thử cho tri thức, bộ suy luận, bộ tính toán, nhận dạng từ toạ độ và sơ đồ tri thức</w:t>
             </w:r>
           </w:p>
         </w:tc>
@@ -12634,7 +12662,7 @@
           <w:sz w:val="26"/>
           <w:szCs w:val="26"/>
         </w:rPr>
-        <w:t xml:space="preserve">45/45 ca kiểm thử tự động đều đạt.</w:t>
+        <w:t xml:space="preserve">50/50 ca kiểm thử tự động đều đạt.</w:t>
       </w:r>
     </w:p>
     <w:p>

</xml_diff>